<commit_message>
remove table add row column
</commit_message>
<xml_diff>
--- a/tst - Copy (2).docx
+++ b/tst - Copy (2).docx
@@ -37,7 +37,27 @@
           <w:sz w:val="28"/>
           <w:lang w:val="ru-RU"/>
         </w:rPr>
-        <w:t>Таблица 1.1 – Fracation 312table</w:t>
+        <w:t xml:space="preserve">Таблица 1.1 – </w:t>
+      </w:r>
+      <w:proofErr w:type="spellStart"/>
+      <w:r>
+        <w:rPr>
+          <w:rFonts w:ascii="Times New Roman" w:hAnsi="Times New Roman"/>
+          <w:color w:val="000000"/>
+          <w:sz w:val="28"/>
+          <w:lang w:val="ru-RU"/>
+        </w:rPr>
+        <w:t>Fracation</w:t>
+      </w:r>
+      <w:proofErr w:type="spellEnd"/>
+      <w:r>
+        <w:rPr>
+          <w:rFonts w:ascii="Times New Roman" w:hAnsi="Times New Roman"/>
+          <w:color w:val="000000"/>
+          <w:sz w:val="28"/>
+          <w:lang w:val="ru-RU"/>
+        </w:rPr>
+        <w:t xml:space="preserve"> 312table</w:t>
       </w:r>
     </w:p>
     <w:tbl>
@@ -1014,14 +1034,52 @@
         <w:spacing w:before="120" w:after="280" w:line="240" w:lineRule="auto"/>
         <w:jc w:val="center"/>
       </w:pPr>
-      <w:r>
-        <w:rPr>
-          <w:rFonts w:ascii="Times New Roman" w:hAnsi="Times New Roman"/>
-          <w:color w:val="000000"/>
-          <w:sz w:val="28"/>
-        </w:rPr>
-        <w:t>Рисунок 1.1 – Новdsdasdое изображение</w:t>
-      </w:r>
+      <w:proofErr w:type="spellStart"/>
+      <w:r>
+        <w:rPr>
+          <w:rFonts w:ascii="Times New Roman" w:hAnsi="Times New Roman"/>
+          <w:color w:val="000000"/>
+          <w:sz w:val="28"/>
+        </w:rPr>
+        <w:t>Рисунок</w:t>
+      </w:r>
+      <w:proofErr w:type="spellEnd"/>
+      <w:r>
+        <w:rPr>
+          <w:rFonts w:ascii="Times New Roman" w:hAnsi="Times New Roman"/>
+          <w:color w:val="000000"/>
+          <w:sz w:val="28"/>
+        </w:rPr>
+        <w:t xml:space="preserve"> 1.1 – </w:t>
+      </w:r>
+      <w:proofErr w:type="spellStart"/>
+      <w:r>
+        <w:rPr>
+          <w:rFonts w:ascii="Times New Roman" w:hAnsi="Times New Roman"/>
+          <w:color w:val="000000"/>
+          <w:sz w:val="28"/>
+        </w:rPr>
+        <w:t>Новdsdasdое</w:t>
+      </w:r>
+      <w:proofErr w:type="spellEnd"/>
+      <w:r>
+        <w:rPr>
+          <w:rFonts w:ascii="Times New Roman" w:hAnsi="Times New Roman"/>
+          <w:color w:val="000000"/>
+          <w:sz w:val="28"/>
+        </w:rPr>
+        <w:t xml:space="preserve"> </w:t>
+      </w:r>
+      <w:proofErr w:type="spellStart"/>
+      <w:r>
+        <w:rPr>
+          <w:rFonts w:ascii="Times New Roman" w:hAnsi="Times New Roman"/>
+          <w:color w:val="000000"/>
+          <w:sz w:val="28"/>
+        </w:rPr>
+        <w:t>изображение</w:t>
+      </w:r>
+      <w:proofErr w:type="spellEnd"/>
     </w:p>
     <w:p>
       <w:pPr>
@@ -1096,6 +1154,7 @@
           <w:lang w:val="ru-RU"/>
         </w:rPr>
       </w:pPr>
+      <w:proofErr w:type="spellStart"/>
       <w:r>
         <w:rPr>
           <w:rFonts w:ascii="Times New Roman" w:hAnsi="Times New Roman"/>
@@ -1104,6 +1163,7 @@
         </w:rPr>
         <w:t>dasda</w:t>
       </w:r>
+      <w:proofErr w:type="spellEnd"/>
       <w:r>
         <w:rPr>
           <w:rFonts w:ascii="Times New Roman" w:hAnsi="Times New Roman"/>
@@ -1113,6 +1173,7 @@
         </w:rPr>
         <w:t>32132131231</w:t>
       </w:r>
+      <w:proofErr w:type="spellStart"/>
       <w:r>
         <w:rPr>
           <w:rFonts w:ascii="Times New Roman" w:hAnsi="Times New Roman"/>
@@ -1121,6 +1182,7 @@
         </w:rPr>
         <w:t>sd</w:t>
       </w:r>
+      <w:proofErr w:type="spellEnd"/>
     </w:p>
     <w:p>
       <w:pPr>
@@ -1131,6 +1193,7 @@
           <w:lang w:val="ru-RU"/>
         </w:rPr>
       </w:pPr>
+      <w:proofErr w:type="spellStart"/>
       <w:r>
         <w:rPr>
           <w:rFonts w:ascii="Times New Roman" w:hAnsi="Times New Roman"/>
@@ -1139,6 +1202,7 @@
         </w:rPr>
         <w:t>dasdasd</w:t>
       </w:r>
+      <w:proofErr w:type="spellEnd"/>
     </w:p>
     <w:p>
       <w:pPr>
@@ -1215,8 +1279,42 @@
           <w:sz w:val="28"/>
           <w:lang w:val="ru-RU"/>
         </w:rPr>
-        <w:t>1.1.1 ну я хитрееее тебя 333проверка го гого</w:t>
-      </w:r>
+        <w:t xml:space="preserve">1.1.1 ну я </w:t>
+      </w:r>
+      <w:proofErr w:type="spellStart"/>
+      <w:r>
+        <w:rPr>
+          <w:rFonts w:ascii="Times New Roman" w:hAnsi="Times New Roman"/>
+          <w:b/>
+          <w:color w:val="000000"/>
+          <w:sz w:val="28"/>
+          <w:lang w:val="ru-RU"/>
+        </w:rPr>
+        <w:t>хитрееее</w:t>
+      </w:r>
+      <w:proofErr w:type="spellEnd"/>
+      <w:r>
+        <w:rPr>
+          <w:rFonts w:ascii="Times New Roman" w:hAnsi="Times New Roman"/>
+          <w:b/>
+          <w:color w:val="000000"/>
+          <w:sz w:val="28"/>
+          <w:lang w:val="ru-RU"/>
+        </w:rPr>
+        <w:t xml:space="preserve"> тебя 333проверка го </w:t>
+      </w:r>
+      <w:proofErr w:type="spellStart"/>
+      <w:r>
+        <w:rPr>
+          <w:rFonts w:ascii="Times New Roman" w:hAnsi="Times New Roman"/>
+          <w:b/>
+          <w:color w:val="000000"/>
+          <w:sz w:val="28"/>
+          <w:lang w:val="ru-RU"/>
+        </w:rPr>
+        <w:t>гого</w:t>
+      </w:r>
+      <w:proofErr w:type="spellEnd"/>
     </w:p>
     <w:p>
       <w:pPr>
@@ -1236,6 +1334,7 @@
         </w:rPr>
         <w:t>[</w:t>
       </w:r>
+      <w:proofErr w:type="spellStart"/>
       <w:r>
         <w:rPr>
           <w:rFonts w:ascii="Times New Roman" w:hAnsi="Times New Roman"/>
@@ -1244,6 +1343,7 @@
         </w:rPr>
         <w:t>bnh</w:t>
       </w:r>
+      <w:proofErr w:type="spellEnd"/>
       <w:r>
         <w:rPr>
           <w:rFonts w:ascii="Times New Roman" w:hAnsi="Times New Roman"/>
@@ -1251,7 +1351,27 @@
           <w:sz w:val="28"/>
           <w:lang w:val="ru-RU"/>
         </w:rPr>
-        <w:t xml:space="preserve"> эомент]</w:t>
+        <w:t xml:space="preserve"> </w:t>
+      </w:r>
+      <w:proofErr w:type="spellStart"/>
+      <w:r>
+        <w:rPr>
+          <w:rFonts w:ascii="Times New Roman" w:hAnsi="Times New Roman"/>
+          <w:color w:val="000000"/>
+          <w:sz w:val="28"/>
+          <w:lang w:val="ru-RU"/>
+        </w:rPr>
+        <w:t>эомент</w:t>
+      </w:r>
+      <w:proofErr w:type="spellEnd"/>
+      <w:r>
+        <w:rPr>
+          <w:rFonts w:ascii="Times New Roman" w:hAnsi="Times New Roman"/>
+          <w:color w:val="000000"/>
+          <w:sz w:val="28"/>
+          <w:lang w:val="ru-RU"/>
+        </w:rPr>
+        <w:t>]</w:t>
       </w:r>
     </w:p>
     <w:p>
@@ -1271,7 +1391,52 @@
           <w:sz w:val="28"/>
           <w:lang w:val="ru-RU"/>
         </w:rPr>
-        <w:t>1.2 Ну если и это заголоовк мошны йто просто молчу</w:t>
+        <w:lastRenderedPageBreak/>
+        <w:t xml:space="preserve">1.2 Ну если и это </w:t>
+      </w:r>
+      <w:proofErr w:type="spellStart"/>
+      <w:r>
+        <w:rPr>
+          <w:rFonts w:ascii="Times New Roman" w:hAnsi="Times New Roman"/>
+          <w:b/>
+          <w:color w:val="000000"/>
+          <w:sz w:val="28"/>
+          <w:lang w:val="ru-RU"/>
+        </w:rPr>
+        <w:t>заголоовк</w:t>
+      </w:r>
+      <w:proofErr w:type="spellEnd"/>
+      <w:r>
+        <w:rPr>
+          <w:rFonts w:ascii="Times New Roman" w:hAnsi="Times New Roman"/>
+          <w:b/>
+          <w:color w:val="000000"/>
+          <w:sz w:val="28"/>
+          <w:lang w:val="ru-RU"/>
+        </w:rPr>
+        <w:t xml:space="preserve"> мошны </w:t>
+      </w:r>
+      <w:proofErr w:type="spellStart"/>
+      <w:r>
+        <w:rPr>
+          <w:rFonts w:ascii="Times New Roman" w:hAnsi="Times New Roman"/>
+          <w:b/>
+          <w:color w:val="000000"/>
+          <w:sz w:val="28"/>
+          <w:lang w:val="ru-RU"/>
+        </w:rPr>
+        <w:t>йто</w:t>
+      </w:r>
+      <w:proofErr w:type="spellEnd"/>
+      <w:r>
+        <w:rPr>
+          <w:rFonts w:ascii="Times New Roman" w:hAnsi="Times New Roman"/>
+          <w:b/>
+          <w:color w:val="000000"/>
+          <w:sz w:val="28"/>
+          <w:lang w:val="ru-RU"/>
+        </w:rPr>
+        <w:t xml:space="preserve"> просто молчу</w:t>
       </w:r>
     </w:p>
     <w:p>
@@ -1283,6 +1448,7 @@
           <w:lang w:val="ru-RU"/>
         </w:rPr>
       </w:pPr>
+      <w:proofErr w:type="spellStart"/>
       <w:r>
         <w:rPr>
           <w:rFonts w:ascii="Times New Roman" w:hAnsi="Times New Roman"/>
@@ -1291,6 +1457,7 @@
         </w:rPr>
         <w:t>pusin</w:t>
       </w:r>
+      <w:proofErr w:type="spellEnd"/>
     </w:p>
     <w:p>
       <w:pPr>
@@ -1301,6 +1468,7 @@
           <w:lang w:val="ru-RU"/>
         </w:rPr>
       </w:pPr>
+      <w:proofErr w:type="spellStart"/>
       <w:r>
         <w:rPr>
           <w:rFonts w:ascii="Times New Roman" w:hAnsi="Times New Roman"/>
@@ -1309,6 +1477,7 @@
         </w:rPr>
         <w:t>pusin</w:t>
       </w:r>
+      <w:proofErr w:type="spellEnd"/>
       <w:r>
         <w:rPr>
           <w:rFonts w:ascii="Times New Roman" w:hAnsi="Times New Roman"/>
@@ -1328,6 +1497,7 @@
           <w:lang w:val="ru-RU"/>
         </w:rPr>
       </w:pPr>
+      <w:proofErr w:type="spellStart"/>
       <w:r>
         <w:rPr>
           <w:rFonts w:ascii="Times New Roman" w:hAnsi="Times New Roman"/>
@@ -1336,6 +1506,7 @@
         </w:rPr>
         <w:t>pusin</w:t>
       </w:r>
+      <w:proofErr w:type="spellEnd"/>
       <w:r>
         <w:rPr>
           <w:rFonts w:ascii="Times New Roman" w:hAnsi="Times New Roman"/>
@@ -1370,13 +1541,23 @@
       <w:pPr>
         <w:spacing w:before="280" w:after="0" w:line="240" w:lineRule="auto"/>
       </w:pPr>
-      <w:r>
-        <w:rPr>
-          <w:rFonts w:ascii="Times New Roman" w:hAnsi="Times New Roman"/>
-          <w:color w:val="000000"/>
-          <w:sz w:val="28"/>
-        </w:rPr>
-        <w:t>Таблица 1.2 – Fracat32ion table</w:t>
+      <w:proofErr w:type="spellStart"/>
+      <w:r>
+        <w:rPr>
+          <w:rFonts w:ascii="Times New Roman" w:hAnsi="Times New Roman"/>
+          <w:color w:val="000000"/>
+          <w:sz w:val="28"/>
+        </w:rPr>
+        <w:t>Таблица</w:t>
+      </w:r>
+      <w:proofErr w:type="spellEnd"/>
+      <w:r>
+        <w:rPr>
+          <w:rFonts w:ascii="Times New Roman" w:hAnsi="Times New Roman"/>
+          <w:color w:val="000000"/>
+          <w:sz w:val="28"/>
+        </w:rPr>
+        <w:t xml:space="preserve"> 1.2 – Fracat32ion table</w:t>
       </w:r>
     </w:p>
     <w:tbl>
@@ -1523,13 +1704,23 @@
         </w:pBdr>
         <w:spacing w:before="280" w:after="0" w:line="240" w:lineRule="auto"/>
       </w:pPr>
+      <w:proofErr w:type="spellStart"/>
       <w:r>
         <w:rPr>
           <w:rFonts w:ascii="Courier New" w:hAnsi="Courier New"/>
           <w:color w:val="000000"/>
           <w:sz w:val="24"/>
         </w:rPr>
-        <w:t>Листинг 3.2 – 32capton new one</w:t>
+        <w:t>Листинг</w:t>
+      </w:r>
+      <w:proofErr w:type="spellEnd"/>
+      <w:r>
+        <w:rPr>
+          <w:rFonts w:ascii="Courier New" w:hAnsi="Courier New"/>
+          <w:color w:val="000000"/>
+          <w:sz w:val="24"/>
+        </w:rPr>
+        <w:t xml:space="preserve"> 3.2 – 32capton new one</w:t>
       </w:r>
     </w:p>
     <w:p>
@@ -1537,13 +1728,23 @@
         <w:spacing w:before="120" w:after="280" w:line="240" w:lineRule="auto"/>
         <w:jc w:val="center"/>
       </w:pPr>
-      <w:r>
-        <w:rPr>
-          <w:rFonts w:ascii="Times New Roman" w:hAnsi="Times New Roman"/>
-          <w:color w:val="000000"/>
-          <w:sz w:val="28"/>
-        </w:rPr>
-        <w:t>Листинг 1.1 – 32capton new one</w:t>
+      <w:proofErr w:type="spellStart"/>
+      <w:r>
+        <w:rPr>
+          <w:rFonts w:ascii="Times New Roman" w:hAnsi="Times New Roman"/>
+          <w:color w:val="000000"/>
+          <w:sz w:val="28"/>
+        </w:rPr>
+        <w:t>Листинг</w:t>
+      </w:r>
+      <w:proofErr w:type="spellEnd"/>
+      <w:r>
+        <w:rPr>
+          <w:rFonts w:ascii="Times New Roman" w:hAnsi="Times New Roman"/>
+          <w:color w:val="000000"/>
+          <w:sz w:val="28"/>
+        </w:rPr>
+        <w:t xml:space="preserve"> 1.1 – 32capton new one</w:t>
       </w:r>
     </w:p>
     <w:p>
@@ -1888,14 +2089,142 @@
         <w:ind w:firstLine="709"/>
         <w:jc w:val="both"/>
       </w:pPr>
-      <w:r>
-        <w:rPr>
-          <w:rFonts w:ascii="Times New Roman" w:hAnsi="Times New Roman"/>
-          <w:color w:val="000000"/>
-          <w:sz w:val="28"/>
-        </w:rPr>
-        <w:t>dksamdkasmdkasmdk amdk smadks amdksa mdkas mdask dms dkas</w:t>
-      </w:r>
+      <w:proofErr w:type="spellStart"/>
+      <w:r>
+        <w:rPr>
+          <w:rFonts w:ascii="Times New Roman" w:hAnsi="Times New Roman"/>
+          <w:color w:val="000000"/>
+          <w:sz w:val="28"/>
+        </w:rPr>
+        <w:t>dksamdkasmdkasmdk</w:t>
+      </w:r>
+      <w:proofErr w:type="spellEnd"/>
+      <w:r>
+        <w:rPr>
+          <w:rFonts w:ascii="Times New Roman" w:hAnsi="Times New Roman"/>
+          <w:color w:val="000000"/>
+          <w:sz w:val="28"/>
+        </w:rPr>
+        <w:t xml:space="preserve"> </w:t>
+      </w:r>
+      <w:proofErr w:type="spellStart"/>
+      <w:r>
+        <w:rPr>
+          <w:rFonts w:ascii="Times New Roman" w:hAnsi="Times New Roman"/>
+          <w:color w:val="000000"/>
+          <w:sz w:val="28"/>
+        </w:rPr>
+        <w:t>amdk</w:t>
+      </w:r>
+      <w:proofErr w:type="spellEnd"/>
+      <w:r>
+        <w:rPr>
+          <w:rFonts w:ascii="Times New Roman" w:hAnsi="Times New Roman"/>
+          <w:color w:val="000000"/>
+          <w:sz w:val="28"/>
+        </w:rPr>
+        <w:t xml:space="preserve"> </w:t>
+      </w:r>
+      <w:proofErr w:type="spellStart"/>
+      <w:r>
+        <w:rPr>
+          <w:rFonts w:ascii="Times New Roman" w:hAnsi="Times New Roman"/>
+          <w:color w:val="000000"/>
+          <w:sz w:val="28"/>
+        </w:rPr>
+        <w:t>smadks</w:t>
+      </w:r>
+      <w:proofErr w:type="spellEnd"/>
+      <w:r>
+        <w:rPr>
+          <w:rFonts w:ascii="Times New Roman" w:hAnsi="Times New Roman"/>
+          <w:color w:val="000000"/>
+          <w:sz w:val="28"/>
+        </w:rPr>
+        <w:t xml:space="preserve"> </w:t>
+      </w:r>
+      <w:proofErr w:type="spellStart"/>
+      <w:r>
+        <w:rPr>
+          <w:rFonts w:ascii="Times New Roman" w:hAnsi="Times New Roman"/>
+          <w:color w:val="000000"/>
+          <w:sz w:val="28"/>
+        </w:rPr>
+        <w:t>amdksa</w:t>
+      </w:r>
+      <w:proofErr w:type="spellEnd"/>
+      <w:r>
+        <w:rPr>
+          <w:rFonts w:ascii="Times New Roman" w:hAnsi="Times New Roman"/>
+          <w:color w:val="000000"/>
+          <w:sz w:val="28"/>
+        </w:rPr>
+        <w:t xml:space="preserve"> </w:t>
+      </w:r>
+      <w:proofErr w:type="spellStart"/>
+      <w:r>
+        <w:rPr>
+          <w:rFonts w:ascii="Times New Roman" w:hAnsi="Times New Roman"/>
+          <w:color w:val="000000"/>
+          <w:sz w:val="28"/>
+        </w:rPr>
+        <w:t>mdkas</w:t>
+      </w:r>
+      <w:proofErr w:type="spellEnd"/>
+      <w:r>
+        <w:rPr>
+          <w:rFonts w:ascii="Times New Roman" w:hAnsi="Times New Roman"/>
+          <w:color w:val="000000"/>
+          <w:sz w:val="28"/>
+        </w:rPr>
+        <w:t xml:space="preserve"> </w:t>
+      </w:r>
+      <w:proofErr w:type="spellStart"/>
+      <w:r>
+        <w:rPr>
+          <w:rFonts w:ascii="Times New Roman" w:hAnsi="Times New Roman"/>
+          <w:color w:val="000000"/>
+          <w:sz w:val="28"/>
+        </w:rPr>
+        <w:t>mdask</w:t>
+      </w:r>
+      <w:proofErr w:type="spellEnd"/>
+      <w:r>
+        <w:rPr>
+          <w:rFonts w:ascii="Times New Roman" w:hAnsi="Times New Roman"/>
+          <w:color w:val="000000"/>
+          <w:sz w:val="28"/>
+        </w:rPr>
+        <w:t xml:space="preserve"> </w:t>
+      </w:r>
+      <w:proofErr w:type="spellStart"/>
+      <w:r>
+        <w:rPr>
+          <w:rFonts w:ascii="Times New Roman" w:hAnsi="Times New Roman"/>
+          <w:color w:val="000000"/>
+          <w:sz w:val="28"/>
+        </w:rPr>
+        <w:t>dms</w:t>
+      </w:r>
+      <w:proofErr w:type="spellEnd"/>
+      <w:r>
+        <w:rPr>
+          <w:rFonts w:ascii="Times New Roman" w:hAnsi="Times New Roman"/>
+          <w:color w:val="000000"/>
+          <w:sz w:val="28"/>
+        </w:rPr>
+        <w:t xml:space="preserve"> </w:t>
+      </w:r>
+      <w:proofErr w:type="spellStart"/>
+      <w:r>
+        <w:rPr>
+          <w:rFonts w:ascii="Times New Roman" w:hAnsi="Times New Roman"/>
+          <w:color w:val="000000"/>
+          <w:sz w:val="28"/>
+        </w:rPr>
+        <w:t>dkas</w:t>
+      </w:r>
+      <w:proofErr w:type="spellEnd"/>
     </w:p>
     <w:p>
       <w:pPr>
@@ -1948,14 +2277,52 @@
         <w:spacing w:before="120" w:after="280" w:line="240" w:lineRule="auto"/>
         <w:jc w:val="center"/>
       </w:pPr>
-      <w:r>
-        <w:rPr>
-          <w:rFonts w:ascii="Times New Roman" w:hAnsi="Times New Roman"/>
-          <w:color w:val="000000"/>
-          <w:sz w:val="28"/>
-        </w:rPr>
-        <w:t>Рисунок 1.3 – red one Новое изображение</w:t>
-      </w:r>
+      <w:proofErr w:type="spellStart"/>
+      <w:r>
+        <w:rPr>
+          <w:rFonts w:ascii="Times New Roman" w:hAnsi="Times New Roman"/>
+          <w:color w:val="000000"/>
+          <w:sz w:val="28"/>
+        </w:rPr>
+        <w:t>Рисунок</w:t>
+      </w:r>
+      <w:proofErr w:type="spellEnd"/>
+      <w:r>
+        <w:rPr>
+          <w:rFonts w:ascii="Times New Roman" w:hAnsi="Times New Roman"/>
+          <w:color w:val="000000"/>
+          <w:sz w:val="28"/>
+        </w:rPr>
+        <w:t xml:space="preserve"> 1.3 – red one </w:t>
+      </w:r>
+      <w:proofErr w:type="spellStart"/>
+      <w:r>
+        <w:rPr>
+          <w:rFonts w:ascii="Times New Roman" w:hAnsi="Times New Roman"/>
+          <w:color w:val="000000"/>
+          <w:sz w:val="28"/>
+        </w:rPr>
+        <w:t>Новое</w:t>
+      </w:r>
+      <w:proofErr w:type="spellEnd"/>
+      <w:r>
+        <w:rPr>
+          <w:rFonts w:ascii="Times New Roman" w:hAnsi="Times New Roman"/>
+          <w:color w:val="000000"/>
+          <w:sz w:val="28"/>
+        </w:rPr>
+        <w:t xml:space="preserve"> </w:t>
+      </w:r>
+      <w:proofErr w:type="spellStart"/>
+      <w:r>
+        <w:rPr>
+          <w:rFonts w:ascii="Times New Roman" w:hAnsi="Times New Roman"/>
+          <w:color w:val="000000"/>
+          <w:sz w:val="28"/>
+        </w:rPr>
+        <w:t>изображение</w:t>
+      </w:r>
+      <w:proofErr w:type="spellEnd"/>
     </w:p>
     <w:tbl>
       <w:tblPr>
@@ -2059,8 +2426,19 @@
           <w:color w:val="000000"/>
           <w:sz w:val="28"/>
         </w:rPr>
-        <w:t>1.3.1 toooto</w:t>
-      </w:r>
+        <w:t xml:space="preserve">1.3.1 </w:t>
+      </w:r>
+      <w:proofErr w:type="spellStart"/>
+      <w:r>
+        <w:rPr>
+          <w:rFonts w:ascii="Times New Roman" w:hAnsi="Times New Roman"/>
+          <w:b/>
+          <w:color w:val="000000"/>
+          <w:sz w:val="28"/>
+        </w:rPr>
+        <w:t>toooto</w:t>
+      </w:r>
+      <w:proofErr w:type="spellEnd"/>
     </w:p>
     <w:p>
       <w:pPr>
@@ -2068,13 +2446,95 @@
         <w:ind w:firstLine="709"/>
         <w:jc w:val="both"/>
       </w:pPr>
-      <w:r>
-        <w:rPr>
-          <w:rFonts w:ascii="Times New Roman" w:hAnsi="Times New Roman"/>
-          <w:color w:val="000000"/>
-          <w:sz w:val="28"/>
-        </w:rPr>
-        <w:t>dlasjd dk askdj lkasdно вот и все par updated</w:t>
+      <w:proofErr w:type="spellStart"/>
+      <w:r>
+        <w:rPr>
+          <w:rFonts w:ascii="Times New Roman" w:hAnsi="Times New Roman"/>
+          <w:color w:val="000000"/>
+          <w:sz w:val="28"/>
+        </w:rPr>
+        <w:t>dlasjd</w:t>
+      </w:r>
+      <w:proofErr w:type="spellEnd"/>
+      <w:r>
+        <w:rPr>
+          <w:rFonts w:ascii="Times New Roman" w:hAnsi="Times New Roman"/>
+          <w:color w:val="000000"/>
+          <w:sz w:val="28"/>
+        </w:rPr>
+        <w:t xml:space="preserve"> dk </w:t>
+      </w:r>
+      <w:proofErr w:type="spellStart"/>
+      <w:r>
+        <w:rPr>
+          <w:rFonts w:ascii="Times New Roman" w:hAnsi="Times New Roman"/>
+          <w:color w:val="000000"/>
+          <w:sz w:val="28"/>
+        </w:rPr>
+        <w:t>askdj</w:t>
+      </w:r>
+      <w:proofErr w:type="spellEnd"/>
+      <w:r>
+        <w:rPr>
+          <w:rFonts w:ascii="Times New Roman" w:hAnsi="Times New Roman"/>
+          <w:color w:val="000000"/>
+          <w:sz w:val="28"/>
+        </w:rPr>
+        <w:t xml:space="preserve"> </w:t>
+      </w:r>
+      <w:proofErr w:type="spellStart"/>
+      <w:r>
+        <w:rPr>
+          <w:rFonts w:ascii="Times New Roman" w:hAnsi="Times New Roman"/>
+          <w:color w:val="000000"/>
+          <w:sz w:val="28"/>
+        </w:rPr>
+        <w:t>lkasdно</w:t>
+      </w:r>
+      <w:proofErr w:type="spellEnd"/>
+      <w:r>
+        <w:rPr>
+          <w:rFonts w:ascii="Times New Roman" w:hAnsi="Times New Roman"/>
+          <w:color w:val="000000"/>
+          <w:sz w:val="28"/>
+        </w:rPr>
+        <w:t xml:space="preserve"> </w:t>
+      </w:r>
+      <w:proofErr w:type="spellStart"/>
+      <w:r>
+        <w:rPr>
+          <w:rFonts w:ascii="Times New Roman" w:hAnsi="Times New Roman"/>
+          <w:color w:val="000000"/>
+          <w:sz w:val="28"/>
+        </w:rPr>
+        <w:t>вот</w:t>
+      </w:r>
+      <w:proofErr w:type="spellEnd"/>
+      <w:r>
+        <w:rPr>
+          <w:rFonts w:ascii="Times New Roman" w:hAnsi="Times New Roman"/>
+          <w:color w:val="000000"/>
+          <w:sz w:val="28"/>
+        </w:rPr>
+        <w:t xml:space="preserve"> и </w:t>
+      </w:r>
+      <w:proofErr w:type="spellStart"/>
+      <w:r>
+        <w:rPr>
+          <w:rFonts w:ascii="Times New Roman" w:hAnsi="Times New Roman"/>
+          <w:color w:val="000000"/>
+          <w:sz w:val="28"/>
+        </w:rPr>
+        <w:t>все</w:t>
+      </w:r>
+      <w:proofErr w:type="spellEnd"/>
+      <w:r>
+        <w:rPr>
+          <w:rFonts w:ascii="Times New Roman" w:hAnsi="Times New Roman"/>
+          <w:color w:val="000000"/>
+          <w:sz w:val="28"/>
+        </w:rPr>
+        <w:t xml:space="preserve"> par updated</w:t>
       </w:r>
     </w:p>
     <w:p>
@@ -2134,8 +2594,40 @@
           <w:color w:val="000000"/>
           <w:sz w:val="28"/>
         </w:rPr>
-        <w:t>1.3.2 new_header105 che dks</w:t>
-      </w:r>
+        <w:lastRenderedPageBreak/>
+        <w:t xml:space="preserve">1.3.2 new_header105 </w:t>
+      </w:r>
+      <w:proofErr w:type="spellStart"/>
+      <w:r>
+        <w:rPr>
+          <w:rFonts w:ascii="Times New Roman" w:hAnsi="Times New Roman"/>
+          <w:b/>
+          <w:color w:val="000000"/>
+          <w:sz w:val="28"/>
+        </w:rPr>
+        <w:t>che</w:t>
+      </w:r>
+      <w:proofErr w:type="spellEnd"/>
+      <w:r>
+        <w:rPr>
+          <w:rFonts w:ascii="Times New Roman" w:hAnsi="Times New Roman"/>
+          <w:b/>
+          <w:color w:val="000000"/>
+          <w:sz w:val="28"/>
+        </w:rPr>
+        <w:t xml:space="preserve"> </w:t>
+      </w:r>
+      <w:proofErr w:type="spellStart"/>
+      <w:r>
+        <w:rPr>
+          <w:rFonts w:ascii="Times New Roman" w:hAnsi="Times New Roman"/>
+          <w:b/>
+          <w:color w:val="000000"/>
+          <w:sz w:val="28"/>
+        </w:rPr>
+        <w:t>dks</w:t>
+      </w:r>
+      <w:proofErr w:type="spellEnd"/>
     </w:p>
     <w:p>
       <w:pPr>
@@ -2153,43 +2645,259 @@
           <w:color w:val="000000"/>
           <w:sz w:val="24"/>
         </w:rPr>
-        <w:t>def move_element_word(self, parent: Element, element: Element, after:Element =None):</w:t>
-      </w:r>
+        <w:t xml:space="preserve">def </w:t>
+      </w:r>
+      <w:proofErr w:type="spellStart"/>
       <w:r>
         <w:rPr>
           <w:rFonts w:ascii="Courier New" w:hAnsi="Courier New"/>
           <w:color w:val="000000"/>
           <w:sz w:val="24"/>
         </w:rPr>
+        <w:t>move_element_word</w:t>
+      </w:r>
+      <w:proofErr w:type="spellEnd"/>
+      <w:r>
+        <w:rPr>
+          <w:rFonts w:ascii="Courier New" w:hAnsi="Courier New"/>
+          <w:color w:val="000000"/>
+          <w:sz w:val="24"/>
+        </w:rPr>
+        <w:t xml:space="preserve">(self, parent: Element, element: Element, </w:t>
+      </w:r>
+      <w:proofErr w:type="spellStart"/>
+      <w:r>
+        <w:rPr>
+          <w:rFonts w:ascii="Courier New" w:hAnsi="Courier New"/>
+          <w:color w:val="000000"/>
+          <w:sz w:val="24"/>
+        </w:rPr>
+        <w:t>after:Element</w:t>
+      </w:r>
+      <w:proofErr w:type="spellEnd"/>
+      <w:r>
+        <w:rPr>
+          <w:rFonts w:ascii="Courier New" w:hAnsi="Courier New"/>
+          <w:color w:val="000000"/>
+          <w:sz w:val="24"/>
+        </w:rPr>
+        <w:t xml:space="preserve"> =None):</w:t>
+      </w:r>
+      <w:r>
+        <w:rPr>
+          <w:rFonts w:ascii="Courier New" w:hAnsi="Courier New"/>
+          <w:color w:val="000000"/>
+          <w:sz w:val="24"/>
+        </w:rPr>
         <w:br/>
-        <w:t xml:space="preserve">        if isinstance(element,Header):</w:t>
-      </w:r>
+        <w:t xml:space="preserve">        if </w:t>
+      </w:r>
+      <w:proofErr w:type="spellStart"/>
       <w:r>
         <w:rPr>
           <w:rFonts w:ascii="Courier New" w:hAnsi="Courier New"/>
           <w:color w:val="000000"/>
           <w:sz w:val="24"/>
         </w:rPr>
+        <w:t>isinstance</w:t>
+      </w:r>
+      <w:proofErr w:type="spellEnd"/>
+      <w:r>
+        <w:rPr>
+          <w:rFonts w:ascii="Courier New" w:hAnsi="Courier New"/>
+          <w:color w:val="000000"/>
+          <w:sz w:val="24"/>
+        </w:rPr>
+        <w:t>(</w:t>
+      </w:r>
+      <w:proofErr w:type="spellStart"/>
+      <w:r>
+        <w:rPr>
+          <w:rFonts w:ascii="Courier New" w:hAnsi="Courier New"/>
+          <w:color w:val="000000"/>
+          <w:sz w:val="24"/>
+        </w:rPr>
+        <w:t>element,Header</w:t>
+      </w:r>
+      <w:proofErr w:type="spellEnd"/>
+      <w:r>
+        <w:rPr>
+          <w:rFonts w:ascii="Courier New" w:hAnsi="Courier New"/>
+          <w:color w:val="000000"/>
+          <w:sz w:val="24"/>
+        </w:rPr>
+        <w:t>):</w:t>
+      </w:r>
+      <w:r>
+        <w:rPr>
+          <w:rFonts w:ascii="Courier New" w:hAnsi="Courier New"/>
+          <w:color w:val="000000"/>
+          <w:sz w:val="24"/>
+        </w:rPr>
         <w:br/>
-        <w:t xml:space="preserve">            self.numberer.adjust_header_levels(parent,element)</w:t>
-      </w:r>
+        <w:t xml:space="preserve">            </w:t>
+      </w:r>
+      <w:proofErr w:type="spellStart"/>
       <w:r>
         <w:rPr>
           <w:rFonts w:ascii="Courier New" w:hAnsi="Courier New"/>
           <w:color w:val="000000"/>
           <w:sz w:val="24"/>
         </w:rPr>
+        <w:t>self.numberer.adjust_header_levels</w:t>
+      </w:r>
+      <w:proofErr w:type="spellEnd"/>
+      <w:r>
+        <w:rPr>
+          <w:rFonts w:ascii="Courier New" w:hAnsi="Courier New"/>
+          <w:color w:val="000000"/>
+          <w:sz w:val="24"/>
+        </w:rPr>
+        <w:t>(</w:t>
+      </w:r>
+      <w:proofErr w:type="spellStart"/>
+      <w:r>
+        <w:rPr>
+          <w:rFonts w:ascii="Courier New" w:hAnsi="Courier New"/>
+          <w:color w:val="000000"/>
+          <w:sz w:val="24"/>
+        </w:rPr>
+        <w:t>parent,element</w:t>
+      </w:r>
+      <w:proofErr w:type="spellEnd"/>
+      <w:r>
+        <w:rPr>
+          <w:rFonts w:ascii="Courier New" w:hAnsi="Courier New"/>
+          <w:color w:val="000000"/>
+          <w:sz w:val="24"/>
+        </w:rPr>
+        <w:t>)</w:t>
+      </w:r>
+      <w:r>
+        <w:rPr>
+          <w:rFonts w:ascii="Courier New" w:hAnsi="Courier New"/>
+          <w:color w:val="000000"/>
+          <w:sz w:val="24"/>
+        </w:rPr>
         <w:br/>
-        <w:t xml:space="preserve">        self.numberer.move_element(parent,element,after)</w:t>
-      </w:r>
+        <w:t xml:space="preserve">        </w:t>
+      </w:r>
+      <w:proofErr w:type="spellStart"/>
       <w:r>
         <w:rPr>
           <w:rFonts w:ascii="Courier New" w:hAnsi="Courier New"/>
           <w:color w:val="000000"/>
           <w:sz w:val="24"/>
         </w:rPr>
+        <w:t>self.numberer.move_element</w:t>
+      </w:r>
+      <w:proofErr w:type="spellEnd"/>
+      <w:r>
+        <w:rPr>
+          <w:rFonts w:ascii="Courier New" w:hAnsi="Courier New"/>
+          <w:color w:val="000000"/>
+          <w:sz w:val="24"/>
+        </w:rPr>
+        <w:t>(</w:t>
+      </w:r>
+      <w:proofErr w:type="spellStart"/>
+      <w:r>
+        <w:rPr>
+          <w:rFonts w:ascii="Courier New" w:hAnsi="Courier New"/>
+          <w:color w:val="000000"/>
+          <w:sz w:val="24"/>
+        </w:rPr>
+        <w:t>parent,element,after</w:t>
+      </w:r>
+      <w:proofErr w:type="spellEnd"/>
+      <w:r>
+        <w:rPr>
+          <w:rFonts w:ascii="Courier New" w:hAnsi="Courier New"/>
+          <w:color w:val="000000"/>
+          <w:sz w:val="24"/>
+        </w:rPr>
+        <w:t>)</w:t>
+      </w:r>
+      <w:r>
+        <w:rPr>
+          <w:rFonts w:ascii="Courier New" w:hAnsi="Courier New"/>
+          <w:color w:val="000000"/>
+          <w:sz w:val="24"/>
+        </w:rPr>
         <w:br/>
-        <w:t xml:space="preserve">        if not isinstance(element,Header) and not isinstance(parent,Header):</w:t>
+        <w:t xml:space="preserve">        if not </w:t>
+      </w:r>
+      <w:proofErr w:type="spellStart"/>
+      <w:r>
+        <w:rPr>
+          <w:rFonts w:ascii="Courier New" w:hAnsi="Courier New"/>
+          <w:color w:val="000000"/>
+          <w:sz w:val="24"/>
+        </w:rPr>
+        <w:t>isinstance</w:t>
+      </w:r>
+      <w:proofErr w:type="spellEnd"/>
+      <w:r>
+        <w:rPr>
+          <w:rFonts w:ascii="Courier New" w:hAnsi="Courier New"/>
+          <w:color w:val="000000"/>
+          <w:sz w:val="24"/>
+        </w:rPr>
+        <w:t>(</w:t>
+      </w:r>
+      <w:proofErr w:type="spellStart"/>
+      <w:r>
+        <w:rPr>
+          <w:rFonts w:ascii="Courier New" w:hAnsi="Courier New"/>
+          <w:color w:val="000000"/>
+          <w:sz w:val="24"/>
+        </w:rPr>
+        <w:t>element,Header</w:t>
+      </w:r>
+      <w:proofErr w:type="spellEnd"/>
+      <w:r>
+        <w:rPr>
+          <w:rFonts w:ascii="Courier New" w:hAnsi="Courier New"/>
+          <w:color w:val="000000"/>
+          <w:sz w:val="24"/>
+        </w:rPr>
+        <w:t xml:space="preserve">) and not </w:t>
+      </w:r>
+      <w:proofErr w:type="spellStart"/>
+      <w:r>
+        <w:rPr>
+          <w:rFonts w:ascii="Courier New" w:hAnsi="Courier New"/>
+          <w:color w:val="000000"/>
+          <w:sz w:val="24"/>
+        </w:rPr>
+        <w:t>isinstance</w:t>
+      </w:r>
+      <w:proofErr w:type="spellEnd"/>
+      <w:r>
+        <w:rPr>
+          <w:rFonts w:ascii="Courier New" w:hAnsi="Courier New"/>
+          <w:color w:val="000000"/>
+          <w:sz w:val="24"/>
+        </w:rPr>
+        <w:t>(</w:t>
+      </w:r>
+      <w:proofErr w:type="spellStart"/>
+      <w:r>
+        <w:rPr>
+          <w:rFonts w:ascii="Courier New" w:hAnsi="Courier New"/>
+          <w:color w:val="000000"/>
+          <w:sz w:val="24"/>
+        </w:rPr>
+        <w:t>parent,Header</w:t>
+      </w:r>
+      <w:proofErr w:type="spellEnd"/>
+      <w:r>
+        <w:rPr>
+          <w:rFonts w:ascii="Courier New" w:hAnsi="Courier New"/>
+          <w:color w:val="000000"/>
+          <w:sz w:val="24"/>
+        </w:rPr>
+        <w:t>):</w:t>
       </w:r>
       <w:r>
         <w:rPr>
@@ -2207,16 +2915,88 @@
           <w:sz w:val="24"/>
         </w:rPr>
         <w:br/>
-        <w:t xml:space="preserve">        if isinstance(element,Header):</w:t>
-      </w:r>
+        <w:t xml:space="preserve">        if </w:t>
+      </w:r>
+      <w:proofErr w:type="spellStart"/>
       <w:r>
         <w:rPr>
           <w:rFonts w:ascii="Courier New" w:hAnsi="Courier New"/>
           <w:color w:val="000000"/>
           <w:sz w:val="24"/>
         </w:rPr>
+        <w:t>isinstance</w:t>
+      </w:r>
+      <w:proofErr w:type="spellEnd"/>
+      <w:r>
+        <w:rPr>
+          <w:rFonts w:ascii="Courier New" w:hAnsi="Courier New"/>
+          <w:color w:val="000000"/>
+          <w:sz w:val="24"/>
+        </w:rPr>
+        <w:t>(</w:t>
+      </w:r>
+      <w:proofErr w:type="spellStart"/>
+      <w:r>
+        <w:rPr>
+          <w:rFonts w:ascii="Courier New" w:hAnsi="Courier New"/>
+          <w:color w:val="000000"/>
+          <w:sz w:val="24"/>
+        </w:rPr>
+        <w:t>element,Header</w:t>
+      </w:r>
+      <w:proofErr w:type="spellEnd"/>
+      <w:r>
+        <w:rPr>
+          <w:rFonts w:ascii="Courier New" w:hAnsi="Courier New"/>
+          <w:color w:val="000000"/>
+          <w:sz w:val="24"/>
+        </w:rPr>
+        <w:t>):</w:t>
+      </w:r>
+      <w:r>
+        <w:rPr>
+          <w:rFonts w:ascii="Courier New" w:hAnsi="Courier New"/>
+          <w:color w:val="000000"/>
+          <w:sz w:val="24"/>
+        </w:rPr>
         <w:br/>
-        <w:t xml:space="preserve">            self._sync_move_to_doc(element,parent,after,element,parent)</w:t>
+        <w:t xml:space="preserve">            self._</w:t>
+      </w:r>
+      <w:proofErr w:type="spellStart"/>
+      <w:r>
+        <w:rPr>
+          <w:rFonts w:ascii="Courier New" w:hAnsi="Courier New"/>
+          <w:color w:val="000000"/>
+          <w:sz w:val="24"/>
+        </w:rPr>
+        <w:t>sync_move_to_doc</w:t>
+      </w:r>
+      <w:proofErr w:type="spellEnd"/>
+      <w:r>
+        <w:rPr>
+          <w:rFonts w:ascii="Courier New" w:hAnsi="Courier New"/>
+          <w:color w:val="000000"/>
+          <w:sz w:val="24"/>
+        </w:rPr>
+        <w:t>(</w:t>
+      </w:r>
+      <w:proofErr w:type="spellStart"/>
+      <w:r>
+        <w:rPr>
+          <w:rFonts w:ascii="Courier New" w:hAnsi="Courier New"/>
+          <w:color w:val="000000"/>
+          <w:sz w:val="24"/>
+        </w:rPr>
+        <w:t>element,parent,after,element,parent</w:t>
+      </w:r>
+      <w:proofErr w:type="spellEnd"/>
+      <w:r>
+        <w:rPr>
+          <w:rFonts w:ascii="Courier New" w:hAnsi="Courier New"/>
+          <w:color w:val="000000"/>
+          <w:sz w:val="24"/>
+        </w:rPr>
+        <w:t>)</w:t>
       </w:r>
       <w:r>
         <w:rPr>
@@ -2234,7 +3014,43 @@
           <w:sz w:val="24"/>
         </w:rPr>
         <w:br/>
-        <w:t xml:space="preserve">            self._sync_move_to_doc(element,parent,after,None,None)</w:t>
+        <w:t xml:space="preserve">            self._</w:t>
+      </w:r>
+      <w:proofErr w:type="spellStart"/>
+      <w:r>
+        <w:rPr>
+          <w:rFonts w:ascii="Courier New" w:hAnsi="Courier New"/>
+          <w:color w:val="000000"/>
+          <w:sz w:val="24"/>
+        </w:rPr>
+        <w:t>sync_move_to_doc</w:t>
+      </w:r>
+      <w:proofErr w:type="spellEnd"/>
+      <w:r>
+        <w:rPr>
+          <w:rFonts w:ascii="Courier New" w:hAnsi="Courier New"/>
+          <w:color w:val="000000"/>
+          <w:sz w:val="24"/>
+        </w:rPr>
+        <w:t>(</w:t>
+      </w:r>
+      <w:proofErr w:type="spellStart"/>
+      <w:r>
+        <w:rPr>
+          <w:rFonts w:ascii="Courier New" w:hAnsi="Courier New"/>
+          <w:color w:val="000000"/>
+          <w:sz w:val="24"/>
+        </w:rPr>
+        <w:t>element,parent,after,None,None</w:t>
+      </w:r>
+      <w:proofErr w:type="spellEnd"/>
+      <w:r>
+        <w:rPr>
+          <w:rFonts w:ascii="Courier New" w:hAnsi="Courier New"/>
+          <w:color w:val="000000"/>
+          <w:sz w:val="24"/>
+        </w:rPr>
+        <w:t>)</w:t>
       </w:r>
     </w:p>
     <w:p>
@@ -2242,13 +3058,41 @@
         <w:spacing w:before="120" w:after="280" w:line="240" w:lineRule="auto"/>
         <w:jc w:val="center"/>
       </w:pPr>
-      <w:r>
-        <w:rPr>
-          <w:rFonts w:ascii="Times New Roman" w:hAnsi="Times New Roman"/>
-          <w:color w:val="000000"/>
-          <w:sz w:val="28"/>
-        </w:rPr>
-        <w:t>Листинг 1.2 – cdasdapton new one</w:t>
+      <w:proofErr w:type="spellStart"/>
+      <w:r>
+        <w:rPr>
+          <w:rFonts w:ascii="Times New Roman" w:hAnsi="Times New Roman"/>
+          <w:color w:val="000000"/>
+          <w:sz w:val="28"/>
+        </w:rPr>
+        <w:t>Листинг</w:t>
+      </w:r>
+      <w:proofErr w:type="spellEnd"/>
+      <w:r>
+        <w:rPr>
+          <w:rFonts w:ascii="Times New Roman" w:hAnsi="Times New Roman"/>
+          <w:color w:val="000000"/>
+          <w:sz w:val="28"/>
+        </w:rPr>
+        <w:t xml:space="preserve"> 1.2 – </w:t>
+      </w:r>
+      <w:proofErr w:type="spellStart"/>
+      <w:r>
+        <w:rPr>
+          <w:rFonts w:ascii="Times New Roman" w:hAnsi="Times New Roman"/>
+          <w:color w:val="000000"/>
+          <w:sz w:val="28"/>
+        </w:rPr>
+        <w:t>cdasdapton</w:t>
+      </w:r>
+      <w:proofErr w:type="spellEnd"/>
+      <w:r>
+        <w:rPr>
+          <w:rFonts w:ascii="Times New Roman" w:hAnsi="Times New Roman"/>
+          <w:color w:val="000000"/>
+          <w:sz w:val="28"/>
+        </w:rPr>
+        <w:t xml:space="preserve"> new one</w:t>
       </w:r>
     </w:p>
     <w:p>
@@ -2263,7 +3107,79 @@
           <w:color w:val="000000"/>
           <w:sz w:val="28"/>
         </w:rPr>
-        <w:t>new_header105; j1nj2eeio12e2m21eio dk askdj lkasdно вот и все par updated</w:t>
+        <w:t xml:space="preserve">new_header105; j1nj2eeio12e2m21eio dk </w:t>
+      </w:r>
+      <w:proofErr w:type="spellStart"/>
+      <w:r>
+        <w:rPr>
+          <w:rFonts w:ascii="Times New Roman" w:hAnsi="Times New Roman"/>
+          <w:color w:val="000000"/>
+          <w:sz w:val="28"/>
+        </w:rPr>
+        <w:t>askdj</w:t>
+      </w:r>
+      <w:proofErr w:type="spellEnd"/>
+      <w:r>
+        <w:rPr>
+          <w:rFonts w:ascii="Times New Roman" w:hAnsi="Times New Roman"/>
+          <w:color w:val="000000"/>
+          <w:sz w:val="28"/>
+        </w:rPr>
+        <w:t xml:space="preserve"> </w:t>
+      </w:r>
+      <w:proofErr w:type="spellStart"/>
+      <w:r>
+        <w:rPr>
+          <w:rFonts w:ascii="Times New Roman" w:hAnsi="Times New Roman"/>
+          <w:color w:val="000000"/>
+          <w:sz w:val="28"/>
+        </w:rPr>
+        <w:t>lkasdно</w:t>
+      </w:r>
+      <w:proofErr w:type="spellEnd"/>
+      <w:r>
+        <w:rPr>
+          <w:rFonts w:ascii="Times New Roman" w:hAnsi="Times New Roman"/>
+          <w:color w:val="000000"/>
+          <w:sz w:val="28"/>
+        </w:rPr>
+        <w:t xml:space="preserve"> </w:t>
+      </w:r>
+      <w:proofErr w:type="spellStart"/>
+      <w:r>
+        <w:rPr>
+          <w:rFonts w:ascii="Times New Roman" w:hAnsi="Times New Roman"/>
+          <w:color w:val="000000"/>
+          <w:sz w:val="28"/>
+        </w:rPr>
+        <w:t>вот</w:t>
+      </w:r>
+      <w:proofErr w:type="spellEnd"/>
+      <w:r>
+        <w:rPr>
+          <w:rFonts w:ascii="Times New Roman" w:hAnsi="Times New Roman"/>
+          <w:color w:val="000000"/>
+          <w:sz w:val="28"/>
+        </w:rPr>
+        <w:t xml:space="preserve"> и </w:t>
+      </w:r>
+      <w:proofErr w:type="spellStart"/>
+      <w:r>
+        <w:rPr>
+          <w:rFonts w:ascii="Times New Roman" w:hAnsi="Times New Roman"/>
+          <w:color w:val="000000"/>
+          <w:sz w:val="28"/>
+        </w:rPr>
+        <w:t>все</w:t>
+      </w:r>
+      <w:proofErr w:type="spellEnd"/>
+      <w:r>
+        <w:rPr>
+          <w:rFonts w:ascii="Times New Roman" w:hAnsi="Times New Roman"/>
+          <w:color w:val="000000"/>
+          <w:sz w:val="28"/>
+        </w:rPr>
+        <w:t xml:space="preserve"> par updated</w:t>
       </w:r>
     </w:p>
     <w:p>
@@ -2278,7 +3194,81 @@
           <w:color w:val="000000"/>
           <w:sz w:val="28"/>
         </w:rPr>
-        <w:t>new_header105 knodskd skds;kdaskdkasd 412 4214но вот и все par updated</w:t>
+        <w:t xml:space="preserve">new_header105 </w:t>
+      </w:r>
+      <w:proofErr w:type="spellStart"/>
+      <w:r>
+        <w:rPr>
+          <w:rFonts w:ascii="Times New Roman" w:hAnsi="Times New Roman"/>
+          <w:color w:val="000000"/>
+          <w:sz w:val="28"/>
+        </w:rPr>
+        <w:t>knodskd</w:t>
+      </w:r>
+      <w:proofErr w:type="spellEnd"/>
+      <w:r>
+        <w:rPr>
+          <w:rFonts w:ascii="Times New Roman" w:hAnsi="Times New Roman"/>
+          <w:color w:val="000000"/>
+          <w:sz w:val="28"/>
+        </w:rPr>
+        <w:t xml:space="preserve"> </w:t>
+      </w:r>
+      <w:proofErr w:type="spellStart"/>
+      <w:proofErr w:type="gramStart"/>
+      <w:r>
+        <w:rPr>
+          <w:rFonts w:ascii="Times New Roman" w:hAnsi="Times New Roman"/>
+          <w:color w:val="000000"/>
+          <w:sz w:val="28"/>
+        </w:rPr>
+        <w:t>skds;kdaskdkasd</w:t>
+      </w:r>
+      <w:proofErr w:type="spellEnd"/>
+      <w:proofErr w:type="gramEnd"/>
+      <w:r>
+        <w:rPr>
+          <w:rFonts w:ascii="Times New Roman" w:hAnsi="Times New Roman"/>
+          <w:color w:val="000000"/>
+          <w:sz w:val="28"/>
+        </w:rPr>
+        <w:t xml:space="preserve"> 412 4214но </w:t>
+      </w:r>
+      <w:proofErr w:type="spellStart"/>
+      <w:r>
+        <w:rPr>
+          <w:rFonts w:ascii="Times New Roman" w:hAnsi="Times New Roman"/>
+          <w:color w:val="000000"/>
+          <w:sz w:val="28"/>
+        </w:rPr>
+        <w:t>вот</w:t>
+      </w:r>
+      <w:proofErr w:type="spellEnd"/>
+      <w:r>
+        <w:rPr>
+          <w:rFonts w:ascii="Times New Roman" w:hAnsi="Times New Roman"/>
+          <w:color w:val="000000"/>
+          <w:sz w:val="28"/>
+        </w:rPr>
+        <w:t xml:space="preserve"> и </w:t>
+      </w:r>
+      <w:proofErr w:type="spellStart"/>
+      <w:r>
+        <w:rPr>
+          <w:rFonts w:ascii="Times New Roman" w:hAnsi="Times New Roman"/>
+          <w:color w:val="000000"/>
+          <w:sz w:val="28"/>
+        </w:rPr>
+        <w:t>все</w:t>
+      </w:r>
+      <w:proofErr w:type="spellEnd"/>
+      <w:r>
+        <w:rPr>
+          <w:rFonts w:ascii="Times New Roman" w:hAnsi="Times New Roman"/>
+          <w:color w:val="000000"/>
+          <w:sz w:val="28"/>
+        </w:rPr>
+        <w:t xml:space="preserve"> par updated</w:t>
       </w:r>
     </w:p>
     <w:p>
@@ -2294,8 +3284,39 @@
           <w:color w:val="000000"/>
           <w:sz w:val="28"/>
         </w:rPr>
-        <w:t>1.3.3 che dks</w:t>
-      </w:r>
+        <w:t xml:space="preserve">1.3.3 </w:t>
+      </w:r>
+      <w:proofErr w:type="spellStart"/>
+      <w:r>
+        <w:rPr>
+          <w:rFonts w:ascii="Times New Roman" w:hAnsi="Times New Roman"/>
+          <w:b/>
+          <w:color w:val="000000"/>
+          <w:sz w:val="28"/>
+        </w:rPr>
+        <w:t>che</w:t>
+      </w:r>
+      <w:proofErr w:type="spellEnd"/>
+      <w:r>
+        <w:rPr>
+          <w:rFonts w:ascii="Times New Roman" w:hAnsi="Times New Roman"/>
+          <w:b/>
+          <w:color w:val="000000"/>
+          <w:sz w:val="28"/>
+        </w:rPr>
+        <w:t xml:space="preserve"> </w:t>
+      </w:r>
+      <w:proofErr w:type="spellStart"/>
+      <w:r>
+        <w:rPr>
+          <w:rFonts w:ascii="Times New Roman" w:hAnsi="Times New Roman"/>
+          <w:b/>
+          <w:color w:val="000000"/>
+          <w:sz w:val="28"/>
+        </w:rPr>
+        <w:t>dks</w:t>
+      </w:r>
+      <w:proofErr w:type="spellEnd"/>
     </w:p>
     <w:p>
       <w:pPr>
@@ -2303,14 +3324,250 @@
         <w:ind w:firstLine="709"/>
         <w:jc w:val="both"/>
       </w:pPr>
-      <w:r>
-        <w:rPr>
-          <w:rFonts w:ascii="Times New Roman" w:hAnsi="Times New Roman"/>
-          <w:color w:val="000000"/>
-          <w:sz w:val="28"/>
-        </w:rPr>
-        <w:t>dasindm; j1nj2eeio12e2m21eio dk askdj lkasdно вот и все par updated dasdasdd ajsdn jasdnjasndj ansdjasn dasnddddddddddddddddddddddddddddddddddsnj ndjs ndj sndj asndjsj</w:t>
-      </w:r>
+      <w:proofErr w:type="spellStart"/>
+      <w:r>
+        <w:rPr>
+          <w:rFonts w:ascii="Times New Roman" w:hAnsi="Times New Roman"/>
+          <w:color w:val="000000"/>
+          <w:sz w:val="28"/>
+        </w:rPr>
+        <w:t>dasindm</w:t>
+      </w:r>
+      <w:proofErr w:type="spellEnd"/>
+      <w:r>
+        <w:rPr>
+          <w:rFonts w:ascii="Times New Roman" w:hAnsi="Times New Roman"/>
+          <w:color w:val="000000"/>
+          <w:sz w:val="28"/>
+        </w:rPr>
+        <w:t xml:space="preserve">; j1nj2eeio12e2m21eio dk </w:t>
+      </w:r>
+      <w:proofErr w:type="spellStart"/>
+      <w:r>
+        <w:rPr>
+          <w:rFonts w:ascii="Times New Roman" w:hAnsi="Times New Roman"/>
+          <w:color w:val="000000"/>
+          <w:sz w:val="28"/>
+        </w:rPr>
+        <w:t>askdj</w:t>
+      </w:r>
+      <w:proofErr w:type="spellEnd"/>
+      <w:r>
+        <w:rPr>
+          <w:rFonts w:ascii="Times New Roman" w:hAnsi="Times New Roman"/>
+          <w:color w:val="000000"/>
+          <w:sz w:val="28"/>
+        </w:rPr>
+        <w:t xml:space="preserve"> </w:t>
+      </w:r>
+      <w:proofErr w:type="spellStart"/>
+      <w:r>
+        <w:rPr>
+          <w:rFonts w:ascii="Times New Roman" w:hAnsi="Times New Roman"/>
+          <w:color w:val="000000"/>
+          <w:sz w:val="28"/>
+        </w:rPr>
+        <w:t>lkasdно</w:t>
+      </w:r>
+      <w:proofErr w:type="spellEnd"/>
+      <w:r>
+        <w:rPr>
+          <w:rFonts w:ascii="Times New Roman" w:hAnsi="Times New Roman"/>
+          <w:color w:val="000000"/>
+          <w:sz w:val="28"/>
+        </w:rPr>
+        <w:t xml:space="preserve"> </w:t>
+      </w:r>
+      <w:proofErr w:type="spellStart"/>
+      <w:r>
+        <w:rPr>
+          <w:rFonts w:ascii="Times New Roman" w:hAnsi="Times New Roman"/>
+          <w:color w:val="000000"/>
+          <w:sz w:val="28"/>
+        </w:rPr>
+        <w:t>вот</w:t>
+      </w:r>
+      <w:proofErr w:type="spellEnd"/>
+      <w:r>
+        <w:rPr>
+          <w:rFonts w:ascii="Times New Roman" w:hAnsi="Times New Roman"/>
+          <w:color w:val="000000"/>
+          <w:sz w:val="28"/>
+        </w:rPr>
+        <w:t xml:space="preserve"> и </w:t>
+      </w:r>
+      <w:proofErr w:type="spellStart"/>
+      <w:r>
+        <w:rPr>
+          <w:rFonts w:ascii="Times New Roman" w:hAnsi="Times New Roman"/>
+          <w:color w:val="000000"/>
+          <w:sz w:val="28"/>
+        </w:rPr>
+        <w:t>все</w:t>
+      </w:r>
+      <w:proofErr w:type="spellEnd"/>
+      <w:r>
+        <w:rPr>
+          <w:rFonts w:ascii="Times New Roman" w:hAnsi="Times New Roman"/>
+          <w:color w:val="000000"/>
+          <w:sz w:val="28"/>
+        </w:rPr>
+        <w:t xml:space="preserve"> par updated </w:t>
+      </w:r>
+      <w:proofErr w:type="spellStart"/>
+      <w:r>
+        <w:rPr>
+          <w:rFonts w:ascii="Times New Roman" w:hAnsi="Times New Roman"/>
+          <w:color w:val="000000"/>
+          <w:sz w:val="28"/>
+        </w:rPr>
+        <w:t>dasdasdd</w:t>
+      </w:r>
+      <w:proofErr w:type="spellEnd"/>
+      <w:r>
+        <w:rPr>
+          <w:rFonts w:ascii="Times New Roman" w:hAnsi="Times New Roman"/>
+          <w:color w:val="000000"/>
+          <w:sz w:val="28"/>
+        </w:rPr>
+        <w:t xml:space="preserve"> </w:t>
+      </w:r>
+      <w:proofErr w:type="spellStart"/>
+      <w:r>
+        <w:rPr>
+          <w:rFonts w:ascii="Times New Roman" w:hAnsi="Times New Roman"/>
+          <w:color w:val="000000"/>
+          <w:sz w:val="28"/>
+        </w:rPr>
+        <w:t>ajsdn</w:t>
+      </w:r>
+      <w:proofErr w:type="spellEnd"/>
+      <w:r>
+        <w:rPr>
+          <w:rFonts w:ascii="Times New Roman" w:hAnsi="Times New Roman"/>
+          <w:color w:val="000000"/>
+          <w:sz w:val="28"/>
+        </w:rPr>
+        <w:t xml:space="preserve"> </w:t>
+      </w:r>
+      <w:proofErr w:type="spellStart"/>
+      <w:r>
+        <w:rPr>
+          <w:rFonts w:ascii="Times New Roman" w:hAnsi="Times New Roman"/>
+          <w:color w:val="000000"/>
+          <w:sz w:val="28"/>
+        </w:rPr>
+        <w:t>jasdnjasndj</w:t>
+      </w:r>
+      <w:proofErr w:type="spellEnd"/>
+      <w:r>
+        <w:rPr>
+          <w:rFonts w:ascii="Times New Roman" w:hAnsi="Times New Roman"/>
+          <w:color w:val="000000"/>
+          <w:sz w:val="28"/>
+        </w:rPr>
+        <w:t xml:space="preserve"> </w:t>
+      </w:r>
+      <w:proofErr w:type="spellStart"/>
+      <w:r>
+        <w:rPr>
+          <w:rFonts w:ascii="Times New Roman" w:hAnsi="Times New Roman"/>
+          <w:color w:val="000000"/>
+          <w:sz w:val="28"/>
+        </w:rPr>
+        <w:t>ansdjasn</w:t>
+      </w:r>
+      <w:proofErr w:type="spellEnd"/>
+      <w:r>
+        <w:rPr>
+          <w:rFonts w:ascii="Times New Roman" w:hAnsi="Times New Roman"/>
+          <w:color w:val="000000"/>
+          <w:sz w:val="28"/>
+        </w:rPr>
+        <w:t xml:space="preserve"> </w:t>
+      </w:r>
+      <w:proofErr w:type="spellStart"/>
+      <w:r>
+        <w:rPr>
+          <w:rFonts w:ascii="Times New Roman" w:hAnsi="Times New Roman"/>
+          <w:color w:val="000000"/>
+          <w:sz w:val="28"/>
+        </w:rPr>
+        <w:t>dasnddddddddddddddddddddddddddddddddddsnj</w:t>
+      </w:r>
+      <w:proofErr w:type="spellEnd"/>
+      <w:r>
+        <w:rPr>
+          <w:rFonts w:ascii="Times New Roman" w:hAnsi="Times New Roman"/>
+          <w:color w:val="000000"/>
+          <w:sz w:val="28"/>
+        </w:rPr>
+        <w:t xml:space="preserve"> </w:t>
+      </w:r>
+      <w:proofErr w:type="spellStart"/>
+      <w:r>
+        <w:rPr>
+          <w:rFonts w:ascii="Times New Roman" w:hAnsi="Times New Roman"/>
+          <w:color w:val="000000"/>
+          <w:sz w:val="28"/>
+        </w:rPr>
+        <w:t>ndjs</w:t>
+      </w:r>
+      <w:proofErr w:type="spellEnd"/>
+      <w:r>
+        <w:rPr>
+          <w:rFonts w:ascii="Times New Roman" w:hAnsi="Times New Roman"/>
+          <w:color w:val="000000"/>
+          <w:sz w:val="28"/>
+        </w:rPr>
+        <w:t xml:space="preserve"> </w:t>
+      </w:r>
+      <w:proofErr w:type="spellStart"/>
+      <w:r>
+        <w:rPr>
+          <w:rFonts w:ascii="Times New Roman" w:hAnsi="Times New Roman"/>
+          <w:color w:val="000000"/>
+          <w:sz w:val="28"/>
+        </w:rPr>
+        <w:t>ndj</w:t>
+      </w:r>
+      <w:proofErr w:type="spellEnd"/>
+      <w:r>
+        <w:rPr>
+          <w:rFonts w:ascii="Times New Roman" w:hAnsi="Times New Roman"/>
+          <w:color w:val="000000"/>
+          <w:sz w:val="28"/>
+        </w:rPr>
+        <w:t xml:space="preserve"> </w:t>
+      </w:r>
+      <w:proofErr w:type="spellStart"/>
+      <w:r>
+        <w:rPr>
+          <w:rFonts w:ascii="Times New Roman" w:hAnsi="Times New Roman"/>
+          <w:color w:val="000000"/>
+          <w:sz w:val="28"/>
+        </w:rPr>
+        <w:t>sndj</w:t>
+      </w:r>
+      <w:proofErr w:type="spellEnd"/>
+      <w:r>
+        <w:rPr>
+          <w:rFonts w:ascii="Times New Roman" w:hAnsi="Times New Roman"/>
+          <w:color w:val="000000"/>
+          <w:sz w:val="28"/>
+        </w:rPr>
+        <w:t xml:space="preserve"> </w:t>
+      </w:r>
+      <w:proofErr w:type="spellStart"/>
+      <w:r>
+        <w:rPr>
+          <w:rFonts w:ascii="Times New Roman" w:hAnsi="Times New Roman"/>
+          <w:color w:val="000000"/>
+          <w:sz w:val="28"/>
+        </w:rPr>
+        <w:t>asndjsj</w:t>
+      </w:r>
+      <w:proofErr w:type="spellEnd"/>
     </w:p>
     <w:p>
       <w:pPr>
@@ -2318,13 +3575,97 @@
         <w:ind w:firstLine="709"/>
         <w:jc w:val="both"/>
       </w:pPr>
-      <w:r>
-        <w:rPr>
-          <w:rFonts w:ascii="Times New Roman" w:hAnsi="Times New Roman"/>
-          <w:color w:val="000000"/>
-          <w:sz w:val="28"/>
-        </w:rPr>
-        <w:t>IMage knodskd skds;kdaskdkasd 412 4214но вот и все par updated</w:t>
+      <w:proofErr w:type="spellStart"/>
+      <w:r>
+        <w:rPr>
+          <w:rFonts w:ascii="Times New Roman" w:hAnsi="Times New Roman"/>
+          <w:color w:val="000000"/>
+          <w:sz w:val="28"/>
+        </w:rPr>
+        <w:t>IMage</w:t>
+      </w:r>
+      <w:proofErr w:type="spellEnd"/>
+      <w:r>
+        <w:rPr>
+          <w:rFonts w:ascii="Times New Roman" w:hAnsi="Times New Roman"/>
+          <w:color w:val="000000"/>
+          <w:sz w:val="28"/>
+        </w:rPr>
+        <w:t xml:space="preserve"> </w:t>
+      </w:r>
+      <w:proofErr w:type="spellStart"/>
+      <w:r>
+        <w:rPr>
+          <w:rFonts w:ascii="Times New Roman" w:hAnsi="Times New Roman"/>
+          <w:color w:val="000000"/>
+          <w:sz w:val="28"/>
+        </w:rPr>
+        <w:t>knodskd</w:t>
+      </w:r>
+      <w:proofErr w:type="spellEnd"/>
+      <w:r>
+        <w:rPr>
+          <w:rFonts w:ascii="Times New Roman" w:hAnsi="Times New Roman"/>
+          <w:color w:val="000000"/>
+          <w:sz w:val="28"/>
+        </w:rPr>
+        <w:t xml:space="preserve"> </w:t>
+      </w:r>
+      <w:proofErr w:type="spellStart"/>
+      <w:proofErr w:type="gramStart"/>
+      <w:r>
+        <w:rPr>
+          <w:rFonts w:ascii="Times New Roman" w:hAnsi="Times New Roman"/>
+          <w:color w:val="000000"/>
+          <w:sz w:val="28"/>
+        </w:rPr>
+        <w:t>skds;kdaskdkasd</w:t>
+      </w:r>
+      <w:proofErr w:type="spellEnd"/>
+      <w:proofErr w:type="gramEnd"/>
+      <w:r>
+        <w:rPr>
+          <w:rFonts w:ascii="Times New Roman" w:hAnsi="Times New Roman"/>
+          <w:color w:val="000000"/>
+          <w:sz w:val="28"/>
+        </w:rPr>
+        <w:t xml:space="preserve"> 412 4214но </w:t>
+      </w:r>
+      <w:proofErr w:type="spellStart"/>
+      <w:r>
+        <w:rPr>
+          <w:rFonts w:ascii="Times New Roman" w:hAnsi="Times New Roman"/>
+          <w:color w:val="000000"/>
+          <w:sz w:val="28"/>
+        </w:rPr>
+        <w:t>вот</w:t>
+      </w:r>
+      <w:proofErr w:type="spellEnd"/>
+      <w:r>
+        <w:rPr>
+          <w:rFonts w:ascii="Times New Roman" w:hAnsi="Times New Roman"/>
+          <w:color w:val="000000"/>
+          <w:sz w:val="28"/>
+        </w:rPr>
+        <w:t xml:space="preserve"> и </w:t>
+      </w:r>
+      <w:proofErr w:type="spellStart"/>
+      <w:r>
+        <w:rPr>
+          <w:rFonts w:ascii="Times New Roman" w:hAnsi="Times New Roman"/>
+          <w:color w:val="000000"/>
+          <w:sz w:val="28"/>
+        </w:rPr>
+        <w:t>все</w:t>
+      </w:r>
+      <w:proofErr w:type="spellEnd"/>
+      <w:r>
+        <w:rPr>
+          <w:rFonts w:ascii="Times New Roman" w:hAnsi="Times New Roman"/>
+          <w:color w:val="000000"/>
+          <w:sz w:val="28"/>
+        </w:rPr>
+        <w:t xml:space="preserve"> par updated</w:t>
       </w:r>
     </w:p>
     <w:p>
@@ -2340,8 +3681,19 @@
           <w:color w:val="000000"/>
           <w:sz w:val="28"/>
         </w:rPr>
-        <w:t>1.4 d заголовок</w:t>
-      </w:r>
+        <w:t xml:space="preserve">1.4 d </w:t>
+      </w:r>
+      <w:proofErr w:type="spellStart"/>
+      <w:r>
+        <w:rPr>
+          <w:rFonts w:ascii="Times New Roman" w:hAnsi="Times New Roman"/>
+          <w:b/>
+          <w:color w:val="000000"/>
+          <w:sz w:val="28"/>
+        </w:rPr>
+        <w:t>заголовок</w:t>
+      </w:r>
+      <w:proofErr w:type="spellEnd"/>
     </w:p>
     <w:p>
       <w:pPr>
@@ -2436,8 +3788,60 @@
           <w:color w:val="000000"/>
           <w:sz w:val="28"/>
         </w:rPr>
-        <w:t>2 проверка го гого</w:t>
-      </w:r>
+        <w:lastRenderedPageBreak/>
+        <w:t xml:space="preserve">2 </w:t>
+      </w:r>
+      <w:proofErr w:type="spellStart"/>
+      <w:r>
+        <w:rPr>
+          <w:rFonts w:ascii="Times New Roman" w:hAnsi="Times New Roman"/>
+          <w:b/>
+          <w:color w:val="000000"/>
+          <w:sz w:val="28"/>
+        </w:rPr>
+        <w:t>проверка</w:t>
+      </w:r>
+      <w:proofErr w:type="spellEnd"/>
+      <w:r>
+        <w:rPr>
+          <w:rFonts w:ascii="Times New Roman" w:hAnsi="Times New Roman"/>
+          <w:b/>
+          <w:color w:val="000000"/>
+          <w:sz w:val="28"/>
+        </w:rPr>
+        <w:t xml:space="preserve"> </w:t>
+      </w:r>
+      <w:proofErr w:type="spellStart"/>
+      <w:r>
+        <w:rPr>
+          <w:rFonts w:ascii="Times New Roman" w:hAnsi="Times New Roman"/>
+          <w:b/>
+          <w:color w:val="000000"/>
+          <w:sz w:val="28"/>
+        </w:rPr>
+        <w:t>го</w:t>
+      </w:r>
+      <w:proofErr w:type="spellEnd"/>
+      <w:r>
+        <w:rPr>
+          <w:rFonts w:ascii="Times New Roman" w:hAnsi="Times New Roman"/>
+          <w:b/>
+          <w:color w:val="000000"/>
+          <w:sz w:val="28"/>
+        </w:rPr>
+        <w:t xml:space="preserve"> </w:t>
+      </w:r>
+      <w:proofErr w:type="spellStart"/>
+      <w:r>
+        <w:rPr>
+          <w:rFonts w:ascii="Times New Roman" w:hAnsi="Times New Roman"/>
+          <w:b/>
+          <w:color w:val="000000"/>
+          <w:sz w:val="28"/>
+        </w:rPr>
+        <w:t>гого</w:t>
+      </w:r>
+      <w:proofErr w:type="spellEnd"/>
     </w:p>
     <w:p>
       <w:pPr>
@@ -2451,8 +3855,18 @@
           <w:color w:val="000000"/>
           <w:sz w:val="28"/>
         </w:rPr>
-        <w:t xml:space="preserve"> ndskm</w:t>
-      </w:r>
+        <w:t xml:space="preserve"> </w:t>
+      </w:r>
+      <w:proofErr w:type="spellStart"/>
+      <w:r>
+        <w:rPr>
+          <w:rFonts w:ascii="Times New Roman" w:hAnsi="Times New Roman"/>
+          <w:color w:val="000000"/>
+          <w:sz w:val="28"/>
+        </w:rPr>
+        <w:t>ndskm</w:t>
+      </w:r>
+      <w:proofErr w:type="spellEnd"/>
     </w:p>
     <w:p>
       <w:pPr>
@@ -2468,8 +3882,60 @@
           <w:color w:val="000000"/>
           <w:sz w:val="28"/>
         </w:rPr>
-        <w:t>3 иди сюда заголовок</w:t>
-      </w:r>
+        <w:lastRenderedPageBreak/>
+        <w:t xml:space="preserve">3 </w:t>
+      </w:r>
+      <w:proofErr w:type="spellStart"/>
+      <w:r>
+        <w:rPr>
+          <w:rFonts w:ascii="Times New Roman" w:hAnsi="Times New Roman"/>
+          <w:b/>
+          <w:color w:val="000000"/>
+          <w:sz w:val="28"/>
+        </w:rPr>
+        <w:t>иди</w:t>
+      </w:r>
+      <w:proofErr w:type="spellEnd"/>
+      <w:r>
+        <w:rPr>
+          <w:rFonts w:ascii="Times New Roman" w:hAnsi="Times New Roman"/>
+          <w:b/>
+          <w:color w:val="000000"/>
+          <w:sz w:val="28"/>
+        </w:rPr>
+        <w:t xml:space="preserve"> </w:t>
+      </w:r>
+      <w:proofErr w:type="spellStart"/>
+      <w:r>
+        <w:rPr>
+          <w:rFonts w:ascii="Times New Roman" w:hAnsi="Times New Roman"/>
+          <w:b/>
+          <w:color w:val="000000"/>
+          <w:sz w:val="28"/>
+        </w:rPr>
+        <w:t>сюда</w:t>
+      </w:r>
+      <w:proofErr w:type="spellEnd"/>
+      <w:r>
+        <w:rPr>
+          <w:rFonts w:ascii="Times New Roman" w:hAnsi="Times New Roman"/>
+          <w:b/>
+          <w:color w:val="000000"/>
+          <w:sz w:val="28"/>
+        </w:rPr>
+        <w:t xml:space="preserve"> </w:t>
+      </w:r>
+      <w:proofErr w:type="spellStart"/>
+      <w:r>
+        <w:rPr>
+          <w:rFonts w:ascii="Times New Roman" w:hAnsi="Times New Roman"/>
+          <w:b/>
+          <w:color w:val="000000"/>
+          <w:sz w:val="28"/>
+        </w:rPr>
+        <w:t>заголовок</w:t>
+      </w:r>
+      <w:proofErr w:type="spellEnd"/>
     </w:p>
     <w:p>
       <w:pPr>
@@ -2481,13 +3947,41 @@
         </w:pBdr>
         <w:spacing w:before="280" w:after="0" w:line="240" w:lineRule="auto"/>
       </w:pPr>
+      <w:proofErr w:type="spellStart"/>
       <w:r>
         <w:rPr>
           <w:rFonts w:ascii="Courier New" w:hAnsi="Courier New"/>
           <w:color w:val="000000"/>
           <w:sz w:val="24"/>
         </w:rPr>
-        <w:t>Листинг 3.1 – capton new one</w:t>
+        <w:t>Листинг</w:t>
+      </w:r>
+      <w:proofErr w:type="spellEnd"/>
+      <w:r>
+        <w:rPr>
+          <w:rFonts w:ascii="Courier New" w:hAnsi="Courier New"/>
+          <w:color w:val="000000"/>
+          <w:sz w:val="24"/>
+        </w:rPr>
+        <w:t xml:space="preserve"> 3.1 – </w:t>
+      </w:r>
+      <w:proofErr w:type="spellStart"/>
+      <w:r>
+        <w:rPr>
+          <w:rFonts w:ascii="Courier New" w:hAnsi="Courier New"/>
+          <w:color w:val="000000"/>
+          <w:sz w:val="24"/>
+        </w:rPr>
+        <w:t>capton</w:t>
+      </w:r>
+      <w:proofErr w:type="spellEnd"/>
+      <w:r>
+        <w:rPr>
+          <w:rFonts w:ascii="Courier New" w:hAnsi="Courier New"/>
+          <w:color w:val="000000"/>
+          <w:sz w:val="24"/>
+        </w:rPr>
+        <w:t xml:space="preserve"> new one</w:t>
       </w:r>
     </w:p>
     <w:p>
@@ -2495,13 +3989,41 @@
         <w:spacing w:before="120" w:after="280" w:line="240" w:lineRule="auto"/>
         <w:jc w:val="center"/>
       </w:pPr>
-      <w:r>
-        <w:rPr>
-          <w:rFonts w:ascii="Times New Roman" w:hAnsi="Times New Roman"/>
-          <w:color w:val="000000"/>
-          <w:sz w:val="28"/>
-        </w:rPr>
-        <w:t>Листинг 3.1 – capton new one</w:t>
+      <w:proofErr w:type="spellStart"/>
+      <w:r>
+        <w:rPr>
+          <w:rFonts w:ascii="Times New Roman" w:hAnsi="Times New Roman"/>
+          <w:color w:val="000000"/>
+          <w:sz w:val="28"/>
+        </w:rPr>
+        <w:t>Листинг</w:t>
+      </w:r>
+      <w:proofErr w:type="spellEnd"/>
+      <w:r>
+        <w:rPr>
+          <w:rFonts w:ascii="Times New Roman" w:hAnsi="Times New Roman"/>
+          <w:color w:val="000000"/>
+          <w:sz w:val="28"/>
+        </w:rPr>
+        <w:t xml:space="preserve"> 3.1 – </w:t>
+      </w:r>
+      <w:proofErr w:type="spellStart"/>
+      <w:r>
+        <w:rPr>
+          <w:rFonts w:ascii="Times New Roman" w:hAnsi="Times New Roman"/>
+          <w:color w:val="000000"/>
+          <w:sz w:val="28"/>
+        </w:rPr>
+        <w:t>capton</w:t>
+      </w:r>
+      <w:proofErr w:type="spellEnd"/>
+      <w:r>
+        <w:rPr>
+          <w:rFonts w:ascii="Times New Roman" w:hAnsi="Times New Roman"/>
+          <w:color w:val="000000"/>
+          <w:sz w:val="28"/>
+        </w:rPr>
+        <w:t xml:space="preserve"> new one</w:t>
       </w:r>
     </w:p>
     <w:p>
@@ -2516,7 +4038,25 @@
           <w:color w:val="000000"/>
           <w:sz w:val="28"/>
         </w:rPr>
-        <w:t>– dsadasd;</w:t>
+        <w:t xml:space="preserve">– </w:t>
+      </w:r>
+      <w:proofErr w:type="spellStart"/>
+      <w:r>
+        <w:rPr>
+          <w:rFonts w:ascii="Times New Roman" w:hAnsi="Times New Roman"/>
+          <w:color w:val="000000"/>
+          <w:sz w:val="28"/>
+        </w:rPr>
+        <w:t>dsadasd</w:t>
+      </w:r>
+      <w:proofErr w:type="spellEnd"/>
+      <w:r>
+        <w:rPr>
+          <w:rFonts w:ascii="Times New Roman" w:hAnsi="Times New Roman"/>
+          <w:color w:val="000000"/>
+          <w:sz w:val="28"/>
+        </w:rPr>
+        <w:t>;</w:t>
       </w:r>
     </w:p>
     <w:p>
@@ -2531,7 +4071,43 @@
           <w:color w:val="000000"/>
           <w:sz w:val="28"/>
         </w:rPr>
-        <w:t>– как-то так;</w:t>
+        <w:t xml:space="preserve">– </w:t>
+      </w:r>
+      <w:proofErr w:type="spellStart"/>
+      <w:r>
+        <w:rPr>
+          <w:rFonts w:ascii="Times New Roman" w:hAnsi="Times New Roman"/>
+          <w:color w:val="000000"/>
+          <w:sz w:val="28"/>
+        </w:rPr>
+        <w:t>как-то</w:t>
+      </w:r>
+      <w:proofErr w:type="spellEnd"/>
+      <w:r>
+        <w:rPr>
+          <w:rFonts w:ascii="Times New Roman" w:hAnsi="Times New Roman"/>
+          <w:color w:val="000000"/>
+          <w:sz w:val="28"/>
+        </w:rPr>
+        <w:t xml:space="preserve"> </w:t>
+      </w:r>
+      <w:proofErr w:type="spellStart"/>
+      <w:r>
+        <w:rPr>
+          <w:rFonts w:ascii="Times New Roman" w:hAnsi="Times New Roman"/>
+          <w:color w:val="000000"/>
+          <w:sz w:val="28"/>
+        </w:rPr>
+        <w:t>так</w:t>
+      </w:r>
+      <w:proofErr w:type="spellEnd"/>
+      <w:r>
+        <w:rPr>
+          <w:rFonts w:ascii="Times New Roman" w:hAnsi="Times New Roman"/>
+          <w:color w:val="000000"/>
+          <w:sz w:val="28"/>
+        </w:rPr>
+        <w:t>;</w:t>
       </w:r>
     </w:p>
     <w:p>
@@ -2561,7 +4137,25 @@
           <w:color w:val="000000"/>
           <w:sz w:val="28"/>
         </w:rPr>
-        <w:t>– ага.</w:t>
+        <w:t xml:space="preserve">– </w:t>
+      </w:r>
+      <w:proofErr w:type="spellStart"/>
+      <w:r>
+        <w:rPr>
+          <w:rFonts w:ascii="Times New Roman" w:hAnsi="Times New Roman"/>
+          <w:color w:val="000000"/>
+          <w:sz w:val="28"/>
+        </w:rPr>
+        <w:t>ага</w:t>
+      </w:r>
+      <w:proofErr w:type="spellEnd"/>
+      <w:r>
+        <w:rPr>
+          <w:rFonts w:ascii="Times New Roman" w:hAnsi="Times New Roman"/>
+          <w:color w:val="000000"/>
+          <w:sz w:val="28"/>
+        </w:rPr>
+        <w:t>.</w:t>
       </w:r>
     </w:p>
     <w:sectPr>

</xml_diff>